<commit_message>
Drop publisher notes from the .docx and support a column graphic
The generated document opened with a shaded checklist block explaining
how to publish. Doug does not need instructions, so the output is now
just the article: optional column graphic, title, subtitle, byline,
body.

The graphic is used automatically if present at a conventional path,
or passed with --graphic. No graphic file is in the repo yet, so the
current builds skip it.

Co-Authored-By: Claude Opus 5 <noreply@anthropic.com>
Claude-Session: https://claude.ai/code/session_01Pk1A5UusdgnU9bEu3BZJo4
</commit_message>
<xml_diff>
--- a/content/substack/first-minutes-on-the-yard.docx
+++ b/content/substack/first-minutes-on-the-yard.docx
@@ -3,91 +3,35 @@
 <w:document xmlns:wpc="http://schemas.microsoft.com/office/word/2010/wordprocessingCanvas" xmlns:mo="http://schemas.microsoft.com/office/mac/office/2008/main" xmlns:mc="http://schemas.openxmlformats.org/markup-compatibility/2006" xmlns:mv="urn:schemas-microsoft-com:mac:vml" xmlns:o="urn:schemas-microsoft-com:office:office" xmlns:r="http://schemas.openxmlformats.org/officeDocument/2006/relationships" xmlns:m="http://schemas.openxmlformats.org/officeDocument/2006/math" xmlns:v="urn:schemas-microsoft-com:vml" xmlns:wp14="http://schemas.microsoft.com/office/word/2010/wordprocessingDrawing" xmlns:wp="http://schemas.openxmlformats.org/drawingml/2006/wordprocessingDrawing" xmlns:w10="urn:schemas-microsoft-com:office:word" xmlns:w="http://schemas.openxmlformats.org/wordprocessingml/2006/main" xmlns:w14="http://schemas.microsoft.com/office/word/2010/wordml" xmlns:wpg="http://schemas.microsoft.com/office/word/2010/wordprocessingGroup" xmlns:wpi="http://schemas.microsoft.com/office/word/2010/wordprocessingInk" xmlns:wne="http://schemas.microsoft.com/office/word/2006/wordml" xmlns:wps="http://schemas.microsoft.com/office/word/2010/wordprocessingShape" mc:Ignorable="w14 wp14">
   <w:body>
     <w:p>
-      <w:pPr>
-        <w:shd w:val="clear" w:color="auto" w:fill="DCE6F1"/>
-      </w:pPr>
       <w:r>
         <w:rPr>
           <w:b/>
-          <w:sz w:val="26"/>
+          <w:sz w:val="36"/>
         </w:rPr>
-        <w:t>PUBLISHER CHECKLIST</w:t>
-      </w:r>
-    </w:p>
-    <w:p>
-      <w:pPr>
-        <w:shd w:val="clear" w:color="auto" w:fill="DCE6F1"/>
-      </w:pPr>
-      <w:r>
-        <w:rPr>
-          <w:b/>
-        </w:rPr>
-        <w:t xml:space="preserve">Title: </w:t>
-      </w:r>
-      <w:r>
         <w:t>I Spent My First Day in Federal Prison Walking Around Looking at Things. That Was Right.</w:t>
       </w:r>
     </w:p>
     <w:p>
-      <w:pPr>
-        <w:shd w:val="clear" w:color="auto" w:fill="DCE6F1"/>
-      </w:pPr>
       <w:r>
         <w:rPr>
-          <w:b/>
+          <w:i/>
+          <w:sz w:val="24"/>
         </w:rPr>
-        <w:t xml:space="preserve">Subtitle (email preview text): </w:t>
-      </w:r>
-      <w:r>
         <w:t>Fourteen years in. What to do when the door opens.</w:t>
       </w:r>
     </w:p>
     <w:p>
-      <w:pPr>
-        <w:shd w:val="clear" w:color="auto" w:fill="DCE6F1"/>
-      </w:pPr>
       <w:r>
-        <w:rPr>
-          <w:b/>
-        </w:rPr>
-        <w:t xml:space="preserve">Column: </w:t>
-      </w:r>
-      <w:r>
-        <w:t>Surviving the Feds: Dispatches from the Inside</w:t>
+        <w:t>By Bilal Khan</w:t>
       </w:r>
     </w:p>
     <w:p>
-      <w:pPr>
-        <w:shd w:val="clear" w:color="auto" w:fill="DCE6F1"/>
-      </w:pPr>
       <w:r>
         <w:rPr>
-          <w:b/>
+          <w:i/>
         </w:rPr>
-        <w:t xml:space="preserve">Author: </w:t>
+        <w:t>Surviving the Feds: Dispatches from the Inside</w:t>
       </w:r>
-      <w:r>
-        <w:t>Bilal Khan (guest author — set byline to guest, not Doug)</w:t>
-      </w:r>
-    </w:p>
-    <w:p>
-      <w:pPr>
-        <w:shd w:val="clear" w:color="auto" w:fill="DCE6F1"/>
-      </w:pPr>
-      <w:r>
-        <w:rPr>
-          <w:b/>
-        </w:rPr>
-        <w:t xml:space="preserve">Paste target: </w:t>
-      </w:r>
-      <w:r>
-        <w:t>Substack editor. Formatting below is paste-ready.</w:t>
-      </w:r>
-    </w:p>
-    <w:p>
-      <w:pPr>
-        <w:shd w:val="clear" w:color="auto" w:fill="DCE6F1"/>
-      </w:pPr>
     </w:p>
     <w:p>
       <w:pPr>
@@ -96,7 +40,6 @@
         </w:pBdr>
       </w:pPr>
     </w:p>
-    <w:p/>
     <w:p>
       <w:r>
         <w:t>I met a guy on the bus to Fort Dix. He was coming from another prison; I was coming from four and a half years of county jails.</w:t>
@@ -401,9 +344,6 @@
       </w:r>
     </w:p>
     <w:p>
-      <w:pPr>
-        <w:jc w:val="left"/>
-      </w:pPr>
       <w:r>
         <w:t>~Bilal</w:t>
       </w:r>

</xml_diff>

<commit_message>
Add the column header graphic to generated documents
Sourced from the author's Drive folder and installed at the path the
generator already looks for, downscaled from 4096px to 1600px wide.
All three dispatches rebuilt with it.

Note: the artwork reads "Intel From The Inside," while the column is
titled "Surviving the Feds: Dispatches from the Inside." Filed under a
title-neutral name pending the author's decision on which is correct.

Co-Authored-By: Claude Opus 5 <noreply@anthropic.com>
Claude-Session: https://claude.ai/code/session_01Pk1A5UusdgnU9bEu3BZJo4
</commit_message>
<xml_diff>
--- a/content/substack/first-minutes-on-the-yard.docx
+++ b/content/substack/first-minutes-on-the-yard.docx
@@ -2,6 +2,45 @@
 <file path=word/document.xml><?xml version="1.0" encoding="utf-8"?>
 <w:document xmlns:wpc="http://schemas.microsoft.com/office/word/2010/wordprocessingCanvas" xmlns:mo="http://schemas.microsoft.com/office/mac/office/2008/main" xmlns:mc="http://schemas.openxmlformats.org/markup-compatibility/2006" xmlns:mv="urn:schemas-microsoft-com:mac:vml" xmlns:o="urn:schemas-microsoft-com:office:office" xmlns:r="http://schemas.openxmlformats.org/officeDocument/2006/relationships" xmlns:m="http://schemas.openxmlformats.org/officeDocument/2006/math" xmlns:v="urn:schemas-microsoft-com:vml" xmlns:wp14="http://schemas.microsoft.com/office/word/2010/wordprocessingDrawing" xmlns:wp="http://schemas.openxmlformats.org/drawingml/2006/wordprocessingDrawing" xmlns:w10="urn:schemas-microsoft-com:office:word" xmlns:w="http://schemas.openxmlformats.org/wordprocessingml/2006/main" xmlns:w14="http://schemas.microsoft.com/office/word/2010/wordml" xmlns:wpg="http://schemas.microsoft.com/office/word/2010/wordprocessingGroup" xmlns:wpi="http://schemas.microsoft.com/office/word/2010/wordprocessingInk" xmlns:wne="http://schemas.microsoft.com/office/word/2006/wordml" xmlns:wps="http://schemas.microsoft.com/office/word/2010/wordprocessingShape" mc:Ignorable="w14 wp14">
   <w:body>
+    <w:p>
+      <w:pPr>
+        <w:jc w:val="center"/>
+      </w:pPr>
+      <w:r>
+        <w:drawing>
+          <wp:inline xmlns:a="http://schemas.openxmlformats.org/drawingml/2006/main" xmlns:pic="http://schemas.openxmlformats.org/drawingml/2006/picture">
+            <wp:extent cx="5943600" cy="3328416"/>
+            <wp:docPr id="1" name="Picture 1"/>
+            <wp:cNvGraphicFramePr>
+              <a:graphicFrameLocks noChangeAspect="1"/>
+            </wp:cNvGraphicFramePr>
+            <a:graphic>
+              <a:graphicData uri="http://schemas.openxmlformats.org/drawingml/2006/picture">
+                <pic:pic>
+                  <pic:nvPicPr>
+                    <pic:cNvPr id="0" name="substack-column-header.png"/>
+                    <pic:cNvPicPr/>
+                  </pic:nvPicPr>
+                  <pic:blipFill>
+                    <a:blip r:embed="rId9"/>
+                    <a:stretch>
+                      <a:fillRect/>
+                    </a:stretch>
+                  </pic:blipFill>
+                  <pic:spPr>
+                    <a:xfrm>
+                      <a:off x="0" y="0"/>
+                      <a:ext cx="5943600" cy="3328416"/>
+                    </a:xfrm>
+                    <a:prstGeom prst="rect"/>
+                  </pic:spPr>
+                </pic:pic>
+              </a:graphicData>
+            </a:graphic>
+          </wp:inline>
+        </w:drawing>
+      </w:r>
+    </w:p>
     <w:p>
       <w:r>
         <w:rPr>

</xml_diff>